<commit_message>
Update sample audit to 78/100 + add PathosBay Free-plan fix log
- Regenerated sample report after live fixes (security headers, robots.txt AI rules, WP Rocket removal)
- reference-pathosbay-fixlog.md documents the origin-.htaccess approach and the memory_limit OOM gotcha
</commit_message>
<xml_diff>
--- a/sample-audit-pathosbay.docx
+++ b/sample-audit-pathosbay.docx
@@ -92,7 +92,7 @@
               <w:tc>
                 <w:tcPr>
                   <w:tcW w:type="dxa" w:w="3120"/>
-                  <w:shd w:val="clear" w:color="auto" w:fill="D97706"/>
+                  <w:shd w:val="clear" w:color="auto" w:fill="16A34A"/>
                   <w:tcMar>
                     <w:top w:w="120" w:type="dxa"/>
                     <w:bottom w:w="120" w:type="dxa"/>
@@ -169,7 +169,7 @@
               <w:tc>
                 <w:tcPr>
                   <w:tcW w:type="dxa" w:w="3120"/>
-                  <w:shd w:val="clear" w:color="auto" w:fill="D97706"/>
+                  <w:shd w:val="clear" w:color="auto" w:fill="16A34A"/>
                   <w:tcMar>
                     <w:top w:w="120" w:type="dxa"/>
                     <w:bottom w:w="120" w:type="dxa"/>
@@ -187,7 +187,7 @@
                       <w:color w:val="FFFFFF"/>
                       <w:sz w:val="72"/>
                     </w:rPr>
-                    <w:t>7</w:t>
+                    <w:t>9</w:t>
                   </w:r>
                 </w:p>
               </w:tc>
@@ -212,7 +212,7 @@
                       <w:color w:val="FFFFFF"/>
                       <w:sz w:val="72"/>
                     </w:rPr>
-                    <w:t>5</w:t>
+                    <w:t>7</w:t>
                   </w:r>
                 </w:p>
               </w:tc>
@@ -246,7 +246,7 @@
               <w:tc>
                 <w:tcPr>
                   <w:tcW w:type="dxa" w:w="3120"/>
-                  <w:shd w:val="clear" w:color="auto" w:fill="D97706"/>
+                  <w:shd w:val="clear" w:color="auto" w:fill="16A34A"/>
                   <w:tcMar>
                     <w:top w:w="120" w:type="dxa"/>
                     <w:bottom w:w="120" w:type="dxa"/>
@@ -264,7 +264,7 @@
                       <w:color w:val="FFFFFF"/>
                       <w:sz w:val="18"/>
                     </w:rPr>
-                    <w:t>On Track</w:t>
+                    <w:t>Strong</w:t>
                   </w:r>
                 </w:p>
               </w:tc>
@@ -334,7 +334,7 @@
                 <w:color w:val="93C5FD"/>
                 <w:sz w:val="24"/>
               </w:rPr>
-              <w:t>Overall Health Score: 62/100</w:t>
+              <w:t>Overall Health Score: 78/100</w:t>
             </w:r>
           </w:p>
           <w:p>
@@ -414,7 +414,7 @@
                 <w:color w:val="1E293B"/>
                 <w:sz w:val="22"/>
               </w:rPr>
-              <w:t>PathosBay (Leading Lifestyle) is technically sound and fully crawlable/indexable, with Organization, Person, and BlogPosting schema on the homepage and real author entities. The main gaps are: (1) thin security headers across ALL routes (no CSP, HSTS, or X-Content-Type-Options; PHP version leaked via X-Powered-By — re-confirmed on homepage, about, contact, and the dental post), (2) no AEO markup — the dental-services post has list content and FAQs in prose but zero FAQ/QAPage or question-phrased heading structure, (3) no BreadcrumbList or LocalBusiness schema despite a contact/about presence, and (4) 4 of 36 homepage images carry empty alt text. GEO signals exist but lack structured-data depth. The site neither blocks nor explicitly allows AI crawlers (robots.txt is wide open).</w:t>
+              <w:t>PathosBay (Leading Lifestyle) is technically sound and fully crawlable/indexable, with Organization, Person, and BlogPosting schema on the homepage and real author entities. Since the prior audit, security headers (CSP/HSTS/X-Content-Type-Options/Referrer-Policy/Permissions-Policy) were added via origin .htaccess and verified live on all routes, the leftover WP Rocket .htaccess block was removed, and robots.txt now carries explicit allow rules for GPTBot, ChatGPT-User, ClaudeBot, PerplexityBot, and Google-Extended. Residual: X-Powered-By: PHP/8.5.9 still emitted (host PHP-FPM ignores expose_php in .user.ini) — accepted as low-severity. Remaining gaps: (1) no AEO markup — the dental-services post has list/FAQ content in prose but zero FAQ/QAPage or question-phrased heading structure, (2) no BreadcrumbList or LocalBusiness schema despite contact/about presence, (3) 4 of 36 homepage images carry empty alt text. GEO signals exist but lack structured-data depth (Author/Dataset).</w:t>
             </w:r>
           </w:p>
         </w:tc>
@@ -597,6 +597,114 @@
               <w:start w:w="100" w:type="dxa"/>
               <w:end w:w="100" w:type="dxa"/>
             </w:tcMar>
+            <w:shd w:val="clear" w:color="auto" w:fill="16A34A"/>
+          </w:tcPr>
+          <w:p>
+            <w:pPr>
+              <w:jc w:val="center"/>
+            </w:pPr>
+            <w:r/>
+            <w:r>
+              <w:rPr>
+                <w:rFonts w:ascii="Arial" w:hAnsi="Arial"/>
+                <w:b/>
+                <w:i w:val="0"/>
+                <w:color w:val="FFFFFF"/>
+                <w:sz w:val="20"/>
+              </w:rPr>
+              <w:t>9/10</w:t>
+            </w:r>
+          </w:p>
+        </w:tc>
+        <w:tc>
+          <w:tcPr>
+            <w:tcW w:type="dxa" w:w="2340"/>
+            <w:tcMar>
+              <w:top w:w="80" w:type="dxa"/>
+              <w:bottom w:w="80" w:type="dxa"/>
+              <w:start w:w="100" w:type="dxa"/>
+              <w:end w:w="100" w:type="dxa"/>
+            </w:tcMar>
+          </w:tcPr>
+          <w:p>
+            <w:pPr>
+              <w:jc w:val="center"/>
+            </w:pPr>
+            <w:r/>
+            <w:r>
+              <w:rPr>
+                <w:rFonts w:ascii="Arial" w:hAnsi="Arial"/>
+                <w:b w:val="0"/>
+                <w:i w:val="0"/>
+                <w:sz w:val="20"/>
+              </w:rPr>
+              <w:t>Strong</w:t>
+            </w:r>
+          </w:p>
+        </w:tc>
+        <w:tc>
+          <w:tcPr>
+            <w:tcW w:type="dxa" w:w="2340"/>
+            <w:tcMar>
+              <w:top w:w="80" w:type="dxa"/>
+              <w:bottom w:w="80" w:type="dxa"/>
+              <w:start w:w="100" w:type="dxa"/>
+              <w:end w:w="100" w:type="dxa"/>
+            </w:tcMar>
+          </w:tcPr>
+          <w:p>
+            <w:pPr>
+              <w:jc w:val="left"/>
+            </w:pPr>
+            <w:r/>
+            <w:r>
+              <w:rPr>
+                <w:rFonts w:ascii="Arial" w:hAnsi="Arial"/>
+                <w:b w:val="0"/>
+                <w:i w:val="0"/>
+                <w:sz w:val="20"/>
+              </w:rPr>
+              <w:t>Strong technical base: HTTPS, canonical, viewport, clean sitemap, security headers now live, WP Rocket residue removed. Residual PHP version header is low-severity.</w:t>
+            </w:r>
+          </w:p>
+        </w:tc>
+      </w:tr>
+      <w:tr>
+        <w:tc>
+          <w:tcPr>
+            <w:tcW w:type="dxa" w:w="2340"/>
+            <w:tcMar>
+              <w:top w:w="80" w:type="dxa"/>
+              <w:bottom w:w="80" w:type="dxa"/>
+              <w:start w:w="100" w:type="dxa"/>
+              <w:end w:w="100" w:type="dxa"/>
+            </w:tcMar>
+          </w:tcPr>
+          <w:p>
+            <w:pPr>
+              <w:jc w:val="left"/>
+            </w:pPr>
+            <w:r/>
+            <w:r>
+              <w:rPr>
+                <w:rFonts w:ascii="Arial" w:hAnsi="Arial"/>
+                <w:b/>
+                <w:i w:val="0"/>
+                <w:sz w:val="20"/>
+              </w:rPr>
+              <w:t>GEO</w:t>
+            </w:r>
+          </w:p>
+        </w:tc>
+        <w:tc>
+          <w:tcPr>
+            <w:tcW w:type="dxa" w:w="2340"/>
+            <w:tcMar>
+              <w:top w:w="80" w:type="dxa"/>
+              <w:bottom w:w="80" w:type="dxa"/>
+              <w:start w:w="100" w:type="dxa"/>
+              <w:end w:w="100" w:type="dxa"/>
+            </w:tcMar>
             <w:shd w:val="clear" w:color="auto" w:fill="D97706"/>
           </w:tcPr>
           <w:p>
@@ -664,115 +772,7 @@
                 <w:i w:val="0"/>
                 <w:sz w:val="20"/>
               </w:rPr>
-              <w:t>Solid technical base (HTTPS, canonical, viewport, clean sitemap) but security headers are thin and image alt coverage is incomplete.</w:t>
-            </w:r>
-          </w:p>
-        </w:tc>
-      </w:tr>
-      <w:tr>
-        <w:tc>
-          <w:tcPr>
-            <w:tcW w:type="dxa" w:w="2340"/>
-            <w:tcMar>
-              <w:top w:w="80" w:type="dxa"/>
-              <w:bottom w:w="80" w:type="dxa"/>
-              <w:start w:w="100" w:type="dxa"/>
-              <w:end w:w="100" w:type="dxa"/>
-            </w:tcMar>
-          </w:tcPr>
-          <w:p>
-            <w:pPr>
-              <w:jc w:val="left"/>
-            </w:pPr>
-            <w:r/>
-            <w:r>
-              <w:rPr>
-                <w:rFonts w:ascii="Arial" w:hAnsi="Arial"/>
-                <w:b/>
-                <w:i w:val="0"/>
-                <w:sz w:val="20"/>
-              </w:rPr>
-              <w:t>GEO</w:t>
-            </w:r>
-          </w:p>
-        </w:tc>
-        <w:tc>
-          <w:tcPr>
-            <w:tcW w:type="dxa" w:w="2340"/>
-            <w:tcMar>
-              <w:top w:w="80" w:type="dxa"/>
-              <w:bottom w:w="80" w:type="dxa"/>
-              <w:start w:w="100" w:type="dxa"/>
-              <w:end w:w="100" w:type="dxa"/>
-            </w:tcMar>
-            <w:shd w:val="clear" w:color="auto" w:fill="D97706"/>
-          </w:tcPr>
-          <w:p>
-            <w:pPr>
-              <w:jc w:val="center"/>
-            </w:pPr>
-            <w:r/>
-            <w:r>
-              <w:rPr>
-                <w:rFonts w:ascii="Arial" w:hAnsi="Arial"/>
-                <w:b/>
-                <w:i w:val="0"/>
-                <w:color w:val="FFFFFF"/>
-                <w:sz w:val="20"/>
-              </w:rPr>
-              <w:t>5/10</w:t>
-            </w:r>
-          </w:p>
-        </w:tc>
-        <w:tc>
-          <w:tcPr>
-            <w:tcW w:type="dxa" w:w="2340"/>
-            <w:tcMar>
-              <w:top w:w="80" w:type="dxa"/>
-              <w:bottom w:w="80" w:type="dxa"/>
-              <w:start w:w="100" w:type="dxa"/>
-              <w:end w:w="100" w:type="dxa"/>
-            </w:tcMar>
-          </w:tcPr>
-          <w:p>
-            <w:pPr>
-              <w:jc w:val="center"/>
-            </w:pPr>
-            <w:r/>
-            <w:r>
-              <w:rPr>
-                <w:rFonts w:ascii="Arial" w:hAnsi="Arial"/>
-                <w:b w:val="0"/>
-                <w:i w:val="0"/>
-                <w:sz w:val="20"/>
-              </w:rPr>
-              <w:t>On Track</w:t>
-            </w:r>
-          </w:p>
-        </w:tc>
-        <w:tc>
-          <w:tcPr>
-            <w:tcW w:type="dxa" w:w="2340"/>
-            <w:tcMar>
-              <w:top w:w="80" w:type="dxa"/>
-              <w:bottom w:w="80" w:type="dxa"/>
-              <w:start w:w="100" w:type="dxa"/>
-              <w:end w:w="100" w:type="dxa"/>
-            </w:tcMar>
-          </w:tcPr>
-          <w:p>
-            <w:pPr>
-              <w:jc w:val="left"/>
-            </w:pPr>
-            <w:r/>
-            <w:r>
-              <w:rPr>
-                <w:rFonts w:ascii="Arial" w:hAnsi="Arial"/>
-                <w:b w:val="0"/>
-                <w:i w:val="0"/>
-                <w:sz w:val="20"/>
-              </w:rPr>
-              <w:t>Decent author entities and Organization schema, but no structured-data depth (Author/Dataset) and AI-crawler posture is undefined.</w:t>
+              <w:t>Real author/Organization entities plus explicit AI-crawler allow rules in robots.txt signal AI-search intent. Structured-data depth (Author/Dataset) still thin.</w:t>
             </w:r>
           </w:p>
         </w:tc>
@@ -880,7 +880,7 @@
                 <w:i w:val="0"/>
                 <w:sz w:val="20"/>
               </w:rPr>
-              <w:t>No FAQ/QAPage or question-phrased headings on posts — featured-snippet and voice readiness are absent.</w:t>
+              <w:t>No FAQ/QAPage or question-phrased headings on posts — featured-snippet and voice readiness absent; the biggest remaining gap.</w:t>
             </w:r>
           </w:p>
         </w:tc>
@@ -936,7 +936,7 @@
                 <w:color w:val="FFFFFF"/>
                 <w:sz w:val="20"/>
               </w:rPr>
-              <w:t>62/100</w:t>
+              <w:t>78/100</w:t>
             </w:r>
           </w:p>
         </w:tc>
@@ -987,7 +987,7 @@
                 <w:i w:val="0"/>
                 <w:sz w:val="20"/>
               </w:rPr>
-              <w:t>Crawlable, indexable, brand-aware — but under-optimized for AI search and snippets.</w:t>
+              <w:t>Crawlable, indexable, brand-aware, with security headers and AI-crawler signals live — but under-optimized for snippets/voice (AEO).</w:t>
             </w:r>
           </w:p>
         </w:tc>
@@ -2106,7 +2106,7 @@
                 <w:i w:val="0"/>
                 <w:sz w:val="18"/>
               </w:rPr>
-              <w:t>No CSP/HSTS/X-Content-Type-Options/Referrer-Policy on ANY of 4 routes; X-Powered-By leaks PHP/8.5.9. NOTE: a leftover WP Rocket block in .htaccess is STILL setting 'X-Powered-By: WP Rocket/3.23.1.1' — remove it.</w:t>
+              <w:t>RESOLVED via origin .htaccess: HSTS, CSP, X-Content-Type-Options, Referrer-Policy, Permissions-Policy all live on all 4 routes (verified 2026-08-27). WP Rocket .htaccess residue REMOVED. RESIDUAL: X-Powered-By: PHP/8.5.9 still emitted by PHP-FPM; host ignores expose_php in .user.ini — accepted as low-severity info disclosure.</w:t>
             </w:r>
           </w:p>
         </w:tc>
@@ -2134,7 +2134,7 @@
                 <w:color w:val="FFFFFF"/>
                 <w:sz w:val="18"/>
               </w:rPr>
-              <w:t>Needs Attention</w:t>
+              <w:t>On Track</w:t>
             </w:r>
           </w:p>
         </w:tc>
@@ -4012,7 +4012,7 @@
                 <w:i w:val="0"/>
                 <w:sz w:val="18"/>
               </w:rPr>
-              <w:t>robots.txt wide open (Disallow:); no GPTBot/ClaudeBot/PerplexityBot rules — neither blocked nor explicitly allowed.</w:t>
+              <w:t>RESOLVED: robots.txt now has explicit allow rules for GPTBot, ChatGPT-User, ClaudeBot, PerplexityBot, Google-Extended (verified live 2026-08-27). Signals AI-search intent to crawlers.</w:t>
             </w:r>
           </w:p>
         </w:tc>
@@ -4040,7 +4040,7 @@
                 <w:color w:val="FFFFFF"/>
                 <w:sz w:val="18"/>
               </w:rPr>
-              <w:t>Needs Attention</w:t>
+              <w:t>On Track</w:t>
             </w:r>
           </w:p>
         </w:tc>
@@ -5365,7 +5365,7 @@
                 <w:i w:val="0"/>
                 <w:sz w:val="18"/>
               </w:rPr>
-              <w:t>Add security headers (CSP, HSTS, X-Content-Type-Options, Referrer-Policy) and suppress X-Powered-By PHP version.</w:t>
+              <w:t>RESOLVED: security headers (CSP/HSTS/XCTO/Referrer/Permissions) added via origin .htaccess — live on all routes. WP Rocket residue removed. RESIDUAL: X-Powered-By: PHP/8.5.9 still emitted (host PHP-FPM ignores expose_php in .user.ini) — accepted as low-severity; revisit via host support if desired.</w:t>
             </w:r>
           </w:p>
         </w:tc>
@@ -5417,7 +5417,7 @@
                 <w:i w:val="0"/>
                 <w:sz w:val="18"/>
               </w:rPr>
-              <w:t>Low</w:t>
+              <w:t>Done</w:t>
             </w:r>
           </w:p>
         </w:tc>
@@ -5443,7 +5443,7 @@
                 <w:i w:val="0"/>
                 <w:sz w:val="18"/>
               </w:rPr>
-              <w:t>Medium</w:t>
+              <w:t>Low</w:t>
             </w:r>
           </w:p>
         </w:tc>
@@ -6035,7 +6035,7 @@
                 <w:i w:val="0"/>
                 <w:sz w:val="18"/>
               </w:rPr>
-              <w:t>Add explicit AI-crawler allow rules (GPTBot, ClaudeBot, PerplexityBot) to robots.txt to signal AI-search intent.</w:t>
+              <w:t>RESOLVED: explicit AI-crawler allow rules (GPTBot, ClaudeBot, PerplexityBot, Google-Extended) added to robots.txt and verified live.</w:t>
             </w:r>
           </w:p>
         </w:tc>
@@ -6087,7 +6087,7 @@
                 <w:i w:val="0"/>
                 <w:sz w:val="18"/>
               </w:rPr>
-              <w:t>Low</w:t>
+              <w:t>Done</w:t>
             </w:r>
           </w:p>
         </w:tc>

</xml_diff>